<commit_message>
Selisih & koreksi sesudah kunci, catatan kaki di setiap struk, Kehadiran selalu terkini; Panduan 16 Okt
Co-Authored-By: Claude Opus 5.5 <noreply@anthropic.com>
</commit_message>
<xml_diff>
--- a/Panduan_Induk_Pembiayaan.docx
+++ b/Panduan_Induk_Pembiayaan.docx
@@ -237,7 +237,7 @@
           <w:sz w:val="19"/>
           <w:szCs w:val="19"/>
         </w:rPr>
-        <w:t xml:space="preserve">Versi: 15 Oktober 2026 (sesuai tampilan aplikasi per tanggal tersebut)</w:t>
+        <w:t xml:space="preserve">Versi: 16 Oktober 2026 (sesuai tampilan aplikasi per tanggal tersebut)</w:t>
       </w:r>
     </w:p>
     <w:p>
@@ -498,6 +498,20 @@
           <w:color w:val="33445A"/>
         </w:rPr>
         <w:t xml:space="preserve">7.3 Kunci periode</w:t>
+      </w:r>
+    </w:p>
+    <w:p>
+      <w:pPr>
+        <w:spacing w:after="50" w:before="0"/>
+        <w:ind w:left="360"/>
+      </w:pPr>
+      <w:r>
+        <w:rPr>
+          <w:b w:val="false"/>
+          <w:bCs w:val="false"/>
+          <w:color w:val="33445A"/>
+        </w:rPr>
+        <w:t xml:space="preserve">7.4 Selisih dan koreksi sesudah kunci</w:t>
       </w:r>
     </w:p>
     <w:p>
@@ -1284,6 +1298,36 @@
       </w:r>
       <w:r>
         <w:t xml:space="preserve"> supaya angkanya tidak bergeser oleh koreksi di belakang hari.</w:t>
+      </w:r>
+    </w:p>
+    <w:p>
+      <w:pPr>
+        <w:pStyle w:val="ListParagraph"/>
+        <w:numPr>
+          <w:ilvl w:val="0"/>
+          <w:numId w:val="2"/>
+        </w:numPr>
+        <w:spacing w:after="60"/>
+      </w:pPr>
+      <w:r>
+        <w:rPr>
+          <w:b/>
+          <w:bCs/>
+        </w:rPr>
+        <w:t xml:space="preserve">Bila kemudian ditemukan kesalahan</w:t>
+      </w:r>
+      <w:r>
+        <w:t xml:space="preserve">: jangan buka kunci. Betulkan datanya di aplikasi asal, lalu selesaikan selisihnya lewat </w:t>
+      </w:r>
+      <w:r>
+        <w:rPr>
+          <w:b/>
+          <w:bCs/>
+        </w:rPr>
+        <w:t xml:space="preserve">Selisih &amp; koreksi…</w:t>
+      </w:r>
+      <w:r>
+        <w:t xml:space="preserve"> (bagian 7).</w:t>
       </w:r>
     </w:p>
     <w:p>
@@ -3126,6 +3170,29 @@
     </w:p>
     <w:p>
       <w:pPr>
+        <w:pStyle w:val="ListParagraph"/>
+        <w:numPr>
+          <w:ilvl w:val="0"/>
+          <w:numId w:val="1"/>
+        </w:numPr>
+        <w:spacing w:after="60"/>
+      </w:pPr>
+      <w:r>
+        <w:t xml:space="preserve">Halaman ini </w:t>
+      </w:r>
+      <w:r>
+        <w:rPr>
+          <w:b/>
+          <w:bCs/>
+        </w:rPr>
+        <w:t xml:space="preserve">selalu membaca data terkini</w:t>
+      </w:r>
+      <w:r>
+        <w:t xml:space="preserve">, juga untuk periode yang sudah dikunci. Koreksi kehadiran sesudah kunci langsung terlihat di sini, sedangkan struk dan rekap honor periode itu tetap dari arsip.</w:t>
+      </w:r>
+    </w:p>
+    <w:p>
+      <w:pPr>
         <w:pStyle w:val="Heading1"/>
         <w:pageBreakBefore/>
       </w:pPr>
@@ -3510,6 +3577,34 @@
       </w:r>
       <w:r>
         <w:t xml:space="preserve">, bukan dihapus.</w:t>
+      </w:r>
+    </w:p>
+    <w:p>
+      <w:pPr>
+        <w:spacing w:after="120"/>
+      </w:pPr>
+      <w:r>
+        <w:t xml:space="preserve">Yang dibayar </w:t>
+      </w:r>
+      <w:r>
+        <w:rPr>
+          <w:b/>
+          <w:bCs/>
+        </w:rPr>
+        <w:t xml:space="preserve">mingguan</w:t>
+      </w:r>
+      <w:r>
+        <w:t xml:space="preserve"> dihitung per pekan Senin–Sabtu (supaya hadir hari Sabtu, mis. lembur, tetap terbayar), tetapi kartu dan kuitansinya menulis pekan </w:t>
+      </w:r>
+      <w:r>
+        <w:rPr>
+          <w:b/>
+          <w:bCs/>
+        </w:rPr>
+        <w:t xml:space="preserve">sampai hari kerja terakhirnya</w:t>
+      </w:r>
+      <w:r>
+        <w:t xml:space="preserve"> menurut Jam Kerja Staf di Data Induk — mis. bekerja Senin–Jumat: "pekan 12 Okt 2026 – 16 Okt 2026".</w:t>
       </w:r>
     </w:p>
     <w:p>
@@ -5644,42 +5739,6 @@
     </w:p>
     <w:p>
       <w:pPr>
-        <w:pStyle w:val="Heading2"/>
-      </w:pPr>
-      <w:r>
-        <w:t xml:space="preserve">7.3 Kunci periode</w:t>
-      </w:r>
-    </w:p>
-    <w:p>
-      <w:pPr>
-        <w:spacing w:after="120"/>
-      </w:pPr>
-      <w:r>
-        <w:t xml:space="preserve">Sesudah honor suatu periode dibayarkan, tekan </w:t>
-      </w:r>
-      <w:r>
-        <w:rPr>
-          <w:b/>
-          <w:bCs/>
-        </w:rPr>
-        <w:t xml:space="preserve">Kunci periode ini</w:t>
-      </w:r>
-      <w:r>
-        <w:t xml:space="preserve"> dan tulis catatannya (mis. "dibayar 5 Oktober"). Seluruh hitungan periode itu — semua tab, Keseluruhan, struk, dan setoran — diarsipkan. Koreksi kehadiran di belakang hari </w:t>
-      </w:r>
-      <w:r>
-        <w:rPr>
-          <w:b/>
-          <w:bCs/>
-        </w:rPr>
-        <w:t xml:space="preserve">tidak lagi menggeser</w:t>
-      </w:r>
-      <w:r>
-        <w:t xml:space="preserve"> angka periode yang terkunci.</w:t>
-      </w:r>
-    </w:p>
-    <w:p>
-      <w:pPr>
         <w:pStyle w:val="ListParagraph"/>
         <w:numPr>
           <w:ilvl w:val="0"/>
@@ -5688,17 +5747,60 @@
         <w:spacing w:after="60"/>
       </w:pPr>
       <w:r>
-        <w:t xml:space="preserve">Periode terkunci menampilkan kotak "</w:t>
-      </w:r>
-      <w:r>
-        <w:rPr>
-          <w:b/>
-          <w:bCs/>
-        </w:rPr>
-        <w:t xml:space="preserve">Periode ini dikunci</w:t>
-      </w:r>
-      <w:r>
-        <w:t xml:space="preserve"> sejak … oleh …".</w:t>
+        <w:rPr>
+          <w:b/>
+          <w:bCs/>
+        </w:rPr>
+        <w:t xml:space="preserve">Catatan kaki</w:t>
+      </w:r>
+      <w:r>
+        <w:t xml:space="preserve"> dari Identitas Dokumen tercetak di </w:t>
+      </w:r>
+      <w:r>
+        <w:rPr>
+          <w:b/>
+          <w:bCs/>
+        </w:rPr>
+        <w:t xml:space="preserve">kiri bawah setiap struk</w:t>
+      </w:r>
+      <w:r>
+        <w:t xml:space="preserve"> dengan huruf kecil miring — per struk, bukan per halaman, supaya kedua struk yang digunting sama-sama membawanya. Bila catatan kaki disembunyikan di Data Induk → Profil Dokumen, struk juga tidak menampilkannya.</w:t>
+      </w:r>
+    </w:p>
+    <w:p>
+      <w:pPr>
+        <w:pStyle w:val="Heading2"/>
+      </w:pPr>
+      <w:r>
+        <w:t xml:space="preserve">7.3 Kunci periode</w:t>
+      </w:r>
+    </w:p>
+    <w:p>
+      <w:pPr>
+        <w:spacing w:after="120"/>
+      </w:pPr>
+      <w:r>
+        <w:t xml:space="preserve">Sesudah honor suatu periode dibayarkan, tekan </w:t>
+      </w:r>
+      <w:r>
+        <w:rPr>
+          <w:b/>
+          <w:bCs/>
+        </w:rPr>
+        <w:t xml:space="preserve">Kunci periode ini</w:t>
+      </w:r>
+      <w:r>
+        <w:t xml:space="preserve"> dan tulis catatannya (mis. "dibayar 5 Oktober"). Seluruh hitungan periode itu — semua tab, Keseluruhan, struk, dan setoran — diarsipkan. Koreksi kehadiran di belakang hari </w:t>
+      </w:r>
+      <w:r>
+        <w:rPr>
+          <w:b/>
+          <w:bCs/>
+        </w:rPr>
+        <w:t xml:space="preserve">tidak lagi menggeser</w:t>
+      </w:r>
+      <w:r>
+        <w:t xml:space="preserve"> angka periode yang terkunci.</w:t>
       </w:r>
     </w:p>
     <w:p>
@@ -5711,7 +5813,27 @@
         <w:spacing w:after="60"/>
       </w:pPr>
       <w:r>
-        <w:t xml:space="preserve">Untuk memperbaiki, tekan </w:t>
+        <w:t xml:space="preserve">Periode terkunci menampilkan kotak "</w:t>
+      </w:r>
+      <w:r>
+        <w:rPr>
+          <w:b/>
+          <w:bCs/>
+        </w:rPr>
+        <w:t xml:space="preserve">Periode ini dikunci</w:t>
+      </w:r>
+      <w:r>
+        <w:t xml:space="preserve"> sejak … oleh …" dengan tombol </w:t>
+      </w:r>
+      <w:r>
+        <w:rPr>
+          <w:b/>
+          <w:bCs/>
+        </w:rPr>
+        <w:t xml:space="preserve">Selisih &amp; koreksi…</w:t>
+      </w:r>
+      <w:r>
+        <w:t xml:space="preserve"> dan </w:t>
       </w:r>
       <w:r>
         <w:rPr>
@@ -5721,7 +5843,7 @@
         <w:t xml:space="preserve">Buka kunci…</w:t>
       </w:r>
       <w:r>
-        <w:t xml:space="preserve"> dan tulis alasannya. Siapa, kapan, dan alasannya tercatat di Riwayat Perubahan.</w:t>
+        <w:t xml:space="preserve">.</w:t>
       </w:r>
     </w:p>
     <w:p>
@@ -5746,6 +5868,787 @@
       <w:r>
         <w:t xml:space="preserve"> (mis. 1–31 Oktober).</w:t>
       </w:r>
+    </w:p>
+    <w:p>
+      <w:pPr>
+        <w:pStyle w:val="ListParagraph"/>
+        <w:numPr>
+          <w:ilvl w:val="0"/>
+          <w:numId w:val="1"/>
+        </w:numPr>
+        <w:spacing w:after="60"/>
+      </w:pPr>
+      <w:r>
+        <w:rPr>
+          <w:b/>
+          <w:bCs/>
+        </w:rPr>
+        <w:t xml:space="preserve">Buka kunci…</w:t>
+      </w:r>
+      <w:r>
+        <w:t xml:space="preserve"> (dengan alasan) hanya bila periodenya belum dibayarkan atau memang harus dihitung ulang seluruhnya. Sesudah dibuka, semua angka dihitung ulang dari data sekarang; arsip lama tetap tersimpan. Siapa, kapan, dan alasannya tercatat di Riwayat Perubahan.</w:t>
+      </w:r>
+    </w:p>
+    <w:p>
+      <w:pPr>
+        <w:pStyle w:val="Heading2"/>
+      </w:pPr>
+      <w:r>
+        <w:t xml:space="preserve">7.4 Selisih dan koreksi sesudah kunci</w:t>
+      </w:r>
+    </w:p>
+    <w:p>
+      <w:pPr>
+        <w:spacing w:after="120"/>
+      </w:pPr>
+      <w:r>
+        <w:t xml:space="preserve">Bila sesudah dibayarkan ditemukan kesalahan (kurang bayar atau lebih bayar), </w:t>
+      </w:r>
+      <w:r>
+        <w:rPr>
+          <w:b/>
+          <w:bCs/>
+        </w:rPr>
+        <w:t xml:space="preserve">periode tidak dibuka ulang</w:t>
+      </w:r>
+      <w:r>
+        <w:t xml:space="preserve">. Struk dan rekap yang sudah dibayarkan tetap; selisihnya diselesaikan dengan dokumen tersendiri. Data kehadiran tetap dibetulkan di aplikasi asal, sehingga rekap kehadiran ikut benar.</w:t>
+      </w:r>
+    </w:p>
+    <w:p>
+      <w:pPr>
+        <w:pStyle w:val="ListParagraph"/>
+        <w:numPr>
+          <w:ilvl w:val="0"/>
+          <w:numId w:val="8"/>
+        </w:numPr>
+        <w:spacing w:after="60"/>
+      </w:pPr>
+      <w:r>
+        <w:t xml:space="preserve">Betulkan dulu datanya di aplikasi asal (kehadiran, pengganti, piket, ekskul) atau besaran/potongannya.</w:t>
+      </w:r>
+    </w:p>
+    <w:p>
+      <w:pPr>
+        <w:pStyle w:val="ListParagraph"/>
+        <w:numPr>
+          <w:ilvl w:val="0"/>
+          <w:numId w:val="8"/>
+        </w:numPr>
+        <w:spacing w:after="60"/>
+      </w:pPr>
+      <w:r>
+        <w:t xml:space="preserve">Di </w:t>
+      </w:r>
+      <w:r>
+        <w:rPr>
+          <w:b/>
+          <w:bCs/>
+        </w:rPr>
+        <w:t xml:space="preserve">Honor dan Transpor</w:t>
+      </w:r>
+      <w:r>
+        <w:t xml:space="preserve">, isi rentang periode yang terkunci, </w:t>
+      </w:r>
+      <w:r>
+        <w:rPr>
+          <w:b/>
+          <w:bCs/>
+        </w:rPr>
+        <w:t xml:space="preserve">Hitung</w:t>
+      </w:r>
+      <w:r>
+        <w:t xml:space="preserve">, lalu tekan </w:t>
+      </w:r>
+      <w:r>
+        <w:rPr>
+          <w:b/>
+          <w:bCs/>
+        </w:rPr>
+        <w:t xml:space="preserve">Selisih &amp; koreksi…</w:t>
+      </w:r>
+      <w:r>
+        <w:t xml:space="preserve">.</w:t>
+      </w:r>
+    </w:p>
+    <w:p>
+      <w:pPr>
+        <w:pStyle w:val="ListParagraph"/>
+        <w:numPr>
+          <w:ilvl w:val="0"/>
+          <w:numId w:val="8"/>
+        </w:numPr>
+        <w:spacing w:after="60"/>
+      </w:pPr>
+      <w:r>
+        <w:t xml:space="preserve">Bagian </w:t>
+      </w:r>
+      <w:r>
+        <w:rPr>
+          <w:b/>
+          <w:bCs/>
+        </w:rPr>
+        <w:t xml:space="preserve">Belum diselesaikan</w:t>
+      </w:r>
+      <w:r>
+        <w:t xml:space="preserve"> memuat orang yang uang tunainya menurut data sekarang berbeda dari yang sudah dibayarkan, lengkap dengan kolom yang berubah (mis. "Honor Mengajar Rp 1.072.000 → Rp 1.052.000"). Periksa satu per satu: bisa jadi bukan kesalahan, melainkan data yang memang diubah sesudahnya.</w:t>
+      </w:r>
+    </w:p>
+    <w:p>
+      <w:pPr>
+        <w:pStyle w:val="ListParagraph"/>
+        <w:numPr>
+          <w:ilvl w:val="0"/>
+          <w:numId w:val="8"/>
+        </w:numPr>
+        <w:spacing w:after="60"/>
+      </w:pPr>
+      <w:r>
+        <w:t xml:space="preserve">Selesaikan tiap orang (lihat tabel di bawah). Dokumennya langsung terunduh, dan orang itu pindah ke bagian </w:t>
+      </w:r>
+      <w:r>
+        <w:rPr>
+          <w:b/>
+          <w:bCs/>
+        </w:rPr>
+        <w:t xml:space="preserve">Koreksi tercatat</w:t>
+      </w:r>
+      <w:r>
+        <w:t xml:space="preserve">.</w:t>
+      </w:r>
+    </w:p>
+    <w:tbl>
+      <w:tblPr>
+        <w:tblW w:type="dxa" w:w="9638"/>
+        <w:tblBorders>
+          <w:top w:val="single" w:color="D5DCE6" w:sz="4"/>
+          <w:left w:val="none" w:color="FFFFFF" w:sz="0"/>
+          <w:bottom w:val="single" w:color="D5DCE6" w:sz="4"/>
+          <w:right w:val="none" w:color="FFFFFF" w:sz="0"/>
+          <w:insideH w:val="single" w:color="D5DCE6" w:sz="4"/>
+          <w:insideV w:val="none" w:color="FFFFFF" w:sz="0"/>
+        </w:tblBorders>
+      </w:tblPr>
+      <w:tblGrid>
+        <w:gridCol w:w="2108"/>
+        <w:gridCol w:w="3614"/>
+        <w:gridCol w:w="3915"/>
+      </w:tblGrid>
+      <w:tr>
+        <w:trPr>
+          <w:cantSplit/>
+          <w:tblHeader/>
+        </w:trPr>
+        <w:tc>
+          <w:tcPr>
+            <w:tcW w:type="dxa" w:w="2108"/>
+            <w:shd w:fill="1D2A3A" w:color="auto" w:val="clear"/>
+            <w:tcMar>
+              <w:top w:type="dxa" w:w="70"/>
+              <w:left w:type="dxa" w:w="110"/>
+              <w:bottom w:type="dxa" w:w="70"/>
+              <w:right w:type="dxa" w:w="110"/>
+            </w:tcMar>
+          </w:tcPr>
+          <w:p>
+            <w:pPr>
+              <w:spacing w:after="0"/>
+            </w:pPr>
+            <w:r>
+              <w:rPr>
+                <w:b/>
+                <w:bCs/>
+                <w:color w:val="FFFFFF"/>
+                <w:sz w:val="19"/>
+                <w:szCs w:val="19"/>
+              </w:rPr>
+              <w:t xml:space="preserve">Keadaan</w:t>
+            </w:r>
+          </w:p>
+        </w:tc>
+        <w:tc>
+          <w:tcPr>
+            <w:tcW w:type="dxa" w:w="3614"/>
+            <w:shd w:fill="1D2A3A" w:color="auto" w:val="clear"/>
+            <w:tcMar>
+              <w:top w:type="dxa" w:w="70"/>
+              <w:left w:type="dxa" w:w="110"/>
+              <w:bottom w:type="dxa" w:w="70"/>
+              <w:right w:type="dxa" w:w="110"/>
+            </w:tcMar>
+          </w:tcPr>
+          <w:p>
+            <w:pPr>
+              <w:spacing w:after="0"/>
+            </w:pPr>
+            <w:r>
+              <w:rPr>
+                <w:b/>
+                <w:bCs/>
+                <w:color w:val="FFFFFF"/>
+                <w:sz w:val="19"/>
+                <w:szCs w:val="19"/>
+              </w:rPr>
+              <w:t xml:space="preserve">Penyelesaian</w:t>
+            </w:r>
+          </w:p>
+        </w:tc>
+        <w:tc>
+          <w:tcPr>
+            <w:tcW w:type="dxa" w:w="3915"/>
+            <w:shd w:fill="1D2A3A" w:color="auto" w:val="clear"/>
+            <w:tcMar>
+              <w:top w:type="dxa" w:w="70"/>
+              <w:left w:type="dxa" w:w="110"/>
+              <w:bottom w:type="dxa" w:w="70"/>
+              <w:right w:type="dxa" w:w="110"/>
+            </w:tcMar>
+          </w:tcPr>
+          <w:p>
+            <w:pPr>
+              <w:spacing w:after="0"/>
+            </w:pPr>
+            <w:r>
+              <w:rPr>
+                <w:b/>
+                <w:bCs/>
+                <w:color w:val="FFFFFF"/>
+                <w:sz w:val="19"/>
+                <w:szCs w:val="19"/>
+              </w:rPr>
+              <w:t xml:space="preserve">Dokumen</w:t>
+            </w:r>
+          </w:p>
+        </w:tc>
+      </w:tr>
+      <w:tr>
+        <w:trPr>
+          <w:cantSplit/>
+        </w:trPr>
+        <w:tc>
+          <w:tcPr>
+            <w:tcW w:type="dxa" w:w="2108"/>
+            <w:tcMar>
+              <w:top w:type="dxa" w:w="70"/>
+              <w:left w:type="dxa" w:w="110"/>
+              <w:bottom w:type="dxa" w:w="70"/>
+              <w:right w:type="dxa" w:w="110"/>
+            </w:tcMar>
+          </w:tcPr>
+          <w:p>
+            <w:pPr>
+              <w:spacing w:after="0"/>
+            </w:pPr>
+            <w:r>
+              <w:rPr>
+                <w:b/>
+                <w:bCs/>
+                <w:sz w:val="19"/>
+                <w:szCs w:val="19"/>
+              </w:rPr>
+              <w:t xml:space="preserve">Kurang bayar</w:t>
+            </w:r>
+          </w:p>
+        </w:tc>
+        <w:tc>
+          <w:tcPr>
+            <w:tcW w:type="dxa" w:w="3614"/>
+            <w:tcMar>
+              <w:top w:type="dxa" w:w="70"/>
+              <w:left w:type="dxa" w:w="110"/>
+              <w:bottom w:type="dxa" w:w="70"/>
+              <w:right w:type="dxa" w:w="110"/>
+            </w:tcMar>
+          </w:tcPr>
+          <w:p>
+            <w:pPr>
+              <w:spacing w:after="0"/>
+            </w:pPr>
+            <w:r>
+              <w:rPr>
+                <w:b/>
+                <w:bCs/>
+                <w:sz w:val="19"/>
+                <w:szCs w:val="19"/>
+              </w:rPr>
+              <w:t xml:space="preserve">Catat kuitansi susulan</w:t>
+            </w:r>
+            <w:r>
+              <w:rPr>
+                <w:sz w:val="19"/>
+                <w:szCs w:val="19"/>
+              </w:rPr>
+              <w:t xml:space="preserve"> — dibayarkan sebesar selisihnya.</w:t>
+            </w:r>
+          </w:p>
+        </w:tc>
+        <w:tc>
+          <w:tcPr>
+            <w:tcW w:type="dxa" w:w="3915"/>
+            <w:tcMar>
+              <w:top w:type="dxa" w:w="70"/>
+              <w:left w:type="dxa" w:w="110"/>
+              <w:bottom w:type="dxa" w:w="70"/>
+              <w:right w:type="dxa" w:w="110"/>
+            </w:tcMar>
+          </w:tcPr>
+          <w:p>
+            <w:pPr>
+              <w:spacing w:after="0"/>
+            </w:pPr>
+            <w:r>
+              <w:rPr>
+                <w:sz w:val="19"/>
+                <w:szCs w:val="19"/>
+              </w:rPr>
+              <w:t xml:space="preserve">Kuitansi "kekurangan pembayaran honor periode …" (Excel), bertanda tangan Kepala Sekolah, Bendahara, dan penerima.</w:t>
+            </w:r>
+          </w:p>
+        </w:tc>
+      </w:tr>
+      <w:tr>
+        <w:trPr>
+          <w:cantSplit/>
+        </w:trPr>
+        <w:tc>
+          <w:tcPr>
+            <w:tcW w:type="dxa" w:w="2108"/>
+            <w:shd w:fill="F6F8FB" w:color="auto" w:val="clear"/>
+            <w:tcMar>
+              <w:top w:type="dxa" w:w="70"/>
+              <w:left w:type="dxa" w:w="110"/>
+              <w:bottom w:type="dxa" w:w="70"/>
+              <w:right w:type="dxa" w:w="110"/>
+            </w:tcMar>
+          </w:tcPr>
+          <w:p>
+            <w:pPr>
+              <w:spacing w:after="0"/>
+            </w:pPr>
+            <w:r>
+              <w:rPr>
+                <w:b/>
+                <w:bCs/>
+                <w:sz w:val="19"/>
+                <w:szCs w:val="19"/>
+              </w:rPr>
+              <w:t xml:space="preserve">Lebih bayar</w:t>
+            </w:r>
+            <w:r>
+              <w:rPr>
+                <w:sz w:val="19"/>
+                <w:szCs w:val="19"/>
+              </w:rPr>
+              <w:t xml:space="preserve">, dikembalikan</w:t>
+            </w:r>
+          </w:p>
+        </w:tc>
+        <w:tc>
+          <w:tcPr>
+            <w:tcW w:type="dxa" w:w="3614"/>
+            <w:shd w:fill="F6F8FB" w:color="auto" w:val="clear"/>
+            <w:tcMar>
+              <w:top w:type="dxa" w:w="70"/>
+              <w:left w:type="dxa" w:w="110"/>
+              <w:bottom w:type="dxa" w:w="70"/>
+              <w:right w:type="dxa" w:w="110"/>
+            </w:tcMar>
+          </w:tcPr>
+          <w:p>
+            <w:pPr>
+              <w:spacing w:after="0"/>
+            </w:pPr>
+            <w:r>
+              <w:rPr>
+                <w:sz w:val="19"/>
+                <w:szCs w:val="19"/>
+              </w:rPr>
+              <w:t xml:space="preserve">Pilih </w:t>
+            </w:r>
+            <w:r>
+              <w:rPr>
+                <w:b/>
+                <w:bCs/>
+                <w:sz w:val="19"/>
+                <w:szCs w:val="19"/>
+              </w:rPr>
+              <w:t xml:space="preserve">Dikembalikan tunai</w:t>
+            </w:r>
+            <w:r>
+              <w:rPr>
+                <w:sz w:val="19"/>
+                <w:szCs w:val="19"/>
+              </w:rPr>
+              <w:t xml:space="preserve">, lalu </w:t>
+            </w:r>
+            <w:r>
+              <w:rPr>
+                <w:b/>
+                <w:bCs/>
+                <w:sz w:val="19"/>
+                <w:szCs w:val="19"/>
+              </w:rPr>
+              <w:t xml:space="preserve">Catat</w:t>
+            </w:r>
+            <w:r>
+              <w:rPr>
+                <w:sz w:val="19"/>
+                <w:szCs w:val="19"/>
+              </w:rPr>
+              <w:t xml:space="preserve">.</w:t>
+            </w:r>
+          </w:p>
+        </w:tc>
+        <w:tc>
+          <w:tcPr>
+            <w:tcW w:type="dxa" w:w="3915"/>
+            <w:shd w:fill="F6F8FB" w:color="auto" w:val="clear"/>
+            <w:tcMar>
+              <w:top w:type="dxa" w:w="70"/>
+              <w:left w:type="dxa" w:w="110"/>
+              <w:bottom w:type="dxa" w:w="70"/>
+              <w:right w:type="dxa" w:w="110"/>
+            </w:tcMar>
+          </w:tcPr>
+          <w:p>
+            <w:pPr>
+              <w:spacing w:after="0"/>
+            </w:pPr>
+            <w:r>
+              <w:rPr>
+                <w:sz w:val="19"/>
+                <w:szCs w:val="19"/>
+              </w:rPr>
+              <w:t xml:space="preserve">Tanda terima pengembalian (Excel): diterima Bendahara dari orangnya, diketahui Kepala Sekolah.</w:t>
+            </w:r>
+          </w:p>
+        </w:tc>
+      </w:tr>
+      <w:tr>
+        <w:trPr>
+          <w:cantSplit/>
+        </w:trPr>
+        <w:tc>
+          <w:tcPr>
+            <w:tcW w:type="dxa" w:w="2108"/>
+            <w:tcMar>
+              <w:top w:type="dxa" w:w="70"/>
+              <w:left w:type="dxa" w:w="110"/>
+              <w:bottom w:type="dxa" w:w="70"/>
+              <w:right w:type="dxa" w:w="110"/>
+            </w:tcMar>
+          </w:tcPr>
+          <w:p>
+            <w:pPr>
+              <w:spacing w:after="0"/>
+            </w:pPr>
+            <w:r>
+              <w:rPr>
+                <w:b/>
+                <w:bCs/>
+                <w:sz w:val="19"/>
+                <w:szCs w:val="19"/>
+              </w:rPr>
+              <w:t xml:space="preserve">Lebih bayar</w:t>
+            </w:r>
+            <w:r>
+              <w:rPr>
+                <w:sz w:val="19"/>
+                <w:szCs w:val="19"/>
+              </w:rPr>
+              <w:t xml:space="preserve">, dipotong</w:t>
+            </w:r>
+          </w:p>
+        </w:tc>
+        <w:tc>
+          <w:tcPr>
+            <w:tcW w:type="dxa" w:w="3614"/>
+            <w:tcMar>
+              <w:top w:type="dxa" w:w="70"/>
+              <w:left w:type="dxa" w:w="110"/>
+              <w:bottom w:type="dxa" w:w="70"/>
+              <w:right w:type="dxa" w:w="110"/>
+            </w:tcMar>
+          </w:tcPr>
+          <w:p>
+            <w:pPr>
+              <w:spacing w:after="0"/>
+            </w:pPr>
+            <w:r>
+              <w:rPr>
+                <w:sz w:val="19"/>
+                <w:szCs w:val="19"/>
+              </w:rPr>
+              <w:t xml:space="preserve">Pilih </w:t>
+            </w:r>
+            <w:r>
+              <w:rPr>
+                <w:b/>
+                <w:bCs/>
+                <w:sz w:val="19"/>
+                <w:szCs w:val="19"/>
+              </w:rPr>
+              <w:t xml:space="preserve">Dipotong bulan…</w:t>
+            </w:r>
+            <w:r>
+              <w:rPr>
+                <w:sz w:val="19"/>
+                <w:szCs w:val="19"/>
+              </w:rPr>
+              <w:t xml:space="preserve">, pilih bulannya (bawaan: bulan berikutnya), lalu </w:t>
+            </w:r>
+            <w:r>
+              <w:rPr>
+                <w:b/>
+                <w:bCs/>
+                <w:sz w:val="19"/>
+                <w:szCs w:val="19"/>
+              </w:rPr>
+              <w:t xml:space="preserve">Catat</w:t>
+            </w:r>
+            <w:r>
+              <w:rPr>
+                <w:sz w:val="19"/>
+                <w:szCs w:val="19"/>
+              </w:rPr>
+              <w:t xml:space="preserve">.</w:t>
+            </w:r>
+          </w:p>
+        </w:tc>
+        <w:tc>
+          <w:tcPr>
+            <w:tcW w:type="dxa" w:w="3915"/>
+            <w:tcMar>
+              <w:top w:type="dxa" w:w="70"/>
+              <w:left w:type="dxa" w:w="110"/>
+              <w:bottom w:type="dxa" w:w="70"/>
+              <w:right w:type="dxa" w:w="110"/>
+            </w:tcMar>
+          </w:tcPr>
+          <w:p>
+            <w:pPr>
+              <w:spacing w:after="0"/>
+            </w:pPr>
+            <w:r>
+              <w:rPr>
+                <w:sz w:val="19"/>
+                <w:szCs w:val="19"/>
+              </w:rPr>
+              <w:t xml:space="preserve">Tidak ada dokumen terpisah: muncul sebagai </w:t>
+            </w:r>
+            <w:r>
+              <w:rPr>
+                <w:b/>
+                <w:bCs/>
+                <w:sz w:val="19"/>
+                <w:szCs w:val="19"/>
+              </w:rPr>
+              <w:t xml:space="preserve">Pot. Lain-lain "Koreksi lebih bayar"</w:t>
+            </w:r>
+            <w:r>
+              <w:rPr>
+                <w:sz w:val="19"/>
+                <w:szCs w:val="19"/>
+              </w:rPr>
+              <w:t xml:space="preserve"> di struk bulan itu.</w:t>
+            </w:r>
+          </w:p>
+        </w:tc>
+      </w:tr>
+    </w:tbl>
+    <w:p>
+      <w:pPr>
+        <w:spacing w:after="120"/>
+      </w:pPr>
+    </w:p>
+    <w:p>
+      <w:pPr>
+        <w:pStyle w:val="ListParagraph"/>
+        <w:numPr>
+          <w:ilvl w:val="0"/>
+          <w:numId w:val="1"/>
+        </w:numPr>
+        <w:spacing w:after="60"/>
+      </w:pPr>
+      <w:r>
+        <w:t xml:space="preserve">Selisih dihitung oleh database: uang tunai menurut data sekarang − yang tercatat di arsip − koreksi yang sudah dicatat. Karena itu selisih yang sama </w:t>
+      </w:r>
+      <w:r>
+        <w:rPr>
+          <w:b/>
+          <w:bCs/>
+        </w:rPr>
+        <w:t xml:space="preserve">tidak bisa dicatat (dibayar) dua kali</w:t>
+      </w:r>
+      <w:r>
+        <w:t xml:space="preserve">.</w:t>
+      </w:r>
+    </w:p>
+    <w:p>
+      <w:pPr>
+        <w:pStyle w:val="ListParagraph"/>
+        <w:numPr>
+          <w:ilvl w:val="0"/>
+          <w:numId w:val="1"/>
+        </w:numPr>
+        <w:spacing w:after="60"/>
+      </w:pPr>
+      <w:r>
+        <w:t xml:space="preserve">Bulan potongan tidak boleh bulan yang sudah masuk periode terkunci (potongannya tidak akan pernah tampil di struk). Pembina dari luar hanya bisa dikembalikan tunai.</w:t>
+      </w:r>
+    </w:p>
+    <w:p>
+      <w:pPr>
+        <w:pStyle w:val="ListParagraph"/>
+        <w:numPr>
+          <w:ilvl w:val="0"/>
+          <w:numId w:val="1"/>
+        </w:numPr>
+        <w:spacing w:after="60"/>
+      </w:pPr>
+      <w:r>
+        <w:t xml:space="preserve">Kuitansi dan tanda terima bisa diunduh ulang dari </w:t>
+      </w:r>
+      <w:r>
+        <w:rPr>
+          <w:b/>
+          <w:bCs/>
+        </w:rPr>
+        <w:t xml:space="preserve">Koreksi tercatat</w:t>
+      </w:r>
+      <w:r>
+        <w:t xml:space="preserve">. Koreksi yang salah dicatat bisa </w:t>
+      </w:r>
+      <w:r>
+        <w:rPr>
+          <w:b/>
+          <w:bCs/>
+        </w:rPr>
+        <w:t xml:space="preserve">Dibatalkan</w:t>
+      </w:r>
+      <w:r>
+        <w:t xml:space="preserve"> dengan alasan; potongan bulan berikutnya ikut dihapus, kecuali bulan itu sudah dikunci. Koreksi tidak pernah dihapus.</w:t>
+      </w:r>
+    </w:p>
+    <w:p>
+      <w:pPr>
+        <w:pStyle w:val="ListParagraph"/>
+        <w:numPr>
+          <w:ilvl w:val="0"/>
+          <w:numId w:val="1"/>
+        </w:numPr>
+        <w:spacing w:after="60"/>
+      </w:pPr>
+      <w:r>
+        <w:t xml:space="preserve">Hanya </w:t>
+      </w:r>
+      <w:r>
+        <w:rPr>
+          <w:b/>
+          <w:bCs/>
+        </w:rPr>
+        <w:t xml:space="preserve">bendahara</w:t>
+      </w:r>
+      <w:r>
+        <w:t xml:space="preserve"> yang mencatat dan membatalkan koreksi; operator hanya melihat.</w:t>
+      </w:r>
+    </w:p>
+    <w:tbl>
+      <w:tblPr>
+        <w:tblW w:type="dxa" w:w="9638"/>
+        <w:tblBorders>
+          <w:top w:val="none" w:color="FFFFFF" w:sz="0"/>
+          <w:left w:val="single" w:color="2F7FD8" w:sz="30"/>
+          <w:bottom w:val="none" w:color="FFFFFF" w:sz="0"/>
+          <w:right w:val="none" w:color="FFFFFF" w:sz="0"/>
+          <w:insideH w:val="none" w:color="FFFFFF" w:sz="0"/>
+          <w:insideV w:val="none" w:color="FFFFFF" w:sz="0"/>
+        </w:tblBorders>
+      </w:tblPr>
+      <w:tblGrid>
+        <w:gridCol w:w="9638"/>
+      </w:tblGrid>
+      <w:tr>
+        <w:trPr>
+          <w:cantSplit/>
+        </w:trPr>
+        <w:tc>
+          <w:tcPr>
+            <w:tcW w:type="dxa" w:w="9638"/>
+            <w:shd w:fill="E8F1FC" w:color="auto" w:val="clear"/>
+            <w:tcMar>
+              <w:top w:type="dxa" w:w="120"/>
+              <w:left w:type="dxa" w:w="200"/>
+              <w:bottom w:type="dxa" w:w="120"/>
+              <w:right w:type="dxa" w:w="160"/>
+            </w:tcMar>
+          </w:tcPr>
+          <w:p>
+            <w:pPr>
+              <w:spacing w:after="40"/>
+            </w:pPr>
+            <w:r>
+              <w:rPr>
+                <w:b/>
+                <w:bCs/>
+                <w:color w:val="2F7FD8"/>
+                <w:sz w:val="20"/>
+                <w:szCs w:val="20"/>
+              </w:rPr>
+              <w:t xml:space="preserve">Buka kunci atau koreksi?</w:t>
+            </w:r>
+          </w:p>
+          <w:p>
+            <w:pPr>
+              <w:spacing w:after="40"/>
+            </w:pPr>
+            <w:r>
+              <w:rPr>
+                <w:sz w:val="19"/>
+                <w:szCs w:val="19"/>
+              </w:rPr>
+              <w:t xml:space="preserve">Sudah dibayarkan → </w:t>
+            </w:r>
+            <w:r>
+              <w:rPr>
+                <w:b/>
+                <w:bCs/>
+                <w:sz w:val="19"/>
+                <w:szCs w:val="19"/>
+              </w:rPr>
+              <w:t xml:space="preserve">Selisih &amp; koreksi</w:t>
+            </w:r>
+            <w:r>
+              <w:rPr>
+                <w:sz w:val="19"/>
+                <w:szCs w:val="19"/>
+              </w:rPr>
+              <w:t xml:space="preserve">. Belum dibayarkan, atau kuncinya keliru (salah rentang) → </w:t>
+            </w:r>
+            <w:r>
+              <w:rPr>
+                <w:b/>
+                <w:bCs/>
+                <w:sz w:val="19"/>
+                <w:szCs w:val="19"/>
+              </w:rPr>
+              <w:t xml:space="preserve">Buka kunci</w:t>
+            </w:r>
+            <w:r>
+              <w:rPr>
+                <w:sz w:val="19"/>
+                <w:szCs w:val="19"/>
+              </w:rPr>
+              <w:t xml:space="preserve">.</w:t>
+            </w:r>
+          </w:p>
+        </w:tc>
+      </w:tr>
+    </w:tbl>
+    <w:p>
+      <w:pPr>
+        <w:spacing w:after="120"/>
+      </w:pPr>
     </w:p>
     <w:p>
       <w:pPr>
@@ -6163,7 +7066,7 @@
         <w:spacing w:after="120"/>
       </w:pPr>
       <w:r>
-        <w:t xml:space="preserve">Nama sekolah, alamat, Kepala Sekolah, Bendahara, para Wakasek, dan catatan kaki yang dipakai di kop dan tanda tangan semua dokumen. Halaman ini hanya menampilkan; ubah di </w:t>
+        <w:t xml:space="preserve">Nama sekolah, alamat, Kepala Sekolah, Bendahara, para Wakasek, dan catatan kaki yang dipakai di kop, tanda tangan, dan kaki dokumen (termasuk kiri bawah setiap struk). Halaman ini hanya menampilkan; ubah di </w:t>
       </w:r>
       <w:r>
         <w:rPr>
@@ -6823,7 +7726,159 @@
                 <w:sz w:val="19"/>
                 <w:szCs w:val="19"/>
               </w:rPr>
-              <w:t xml:space="preserve"> lagi. Bila periodenya sudah dikunci, buka kunci dulu.</w:t>
+              <w:t xml:space="preserve"> lagi. Bila periodenya sudah dikunci dan dibayarkan, selesaikan selisihnya lewat </w:t>
+            </w:r>
+            <w:r>
+              <w:rPr>
+                <w:b/>
+                <w:bCs/>
+                <w:sz w:val="19"/>
+                <w:szCs w:val="19"/>
+              </w:rPr>
+              <w:t xml:space="preserve">Selisih &amp; koreksi…</w:t>
+            </w:r>
+            <w:r>
+              <w:rPr>
+                <w:sz w:val="19"/>
+                <w:szCs w:val="19"/>
+              </w:rPr>
+              <w:t xml:space="preserve"> (bagian 7), jangan buka kunci.</w:t>
+            </w:r>
+          </w:p>
+        </w:tc>
+      </w:tr>
+      <w:tr>
+        <w:trPr>
+          <w:cantSplit/>
+        </w:trPr>
+        <w:tc>
+          <w:tcPr>
+            <w:tcW w:type="dxa" w:w="4176"/>
+            <w:tcMar>
+              <w:top w:type="dxa" w:w="70"/>
+              <w:left w:type="dxa" w:w="110"/>
+              <w:bottom w:type="dxa" w:w="70"/>
+              <w:right w:type="dxa" w:w="110"/>
+            </w:tcMar>
+          </w:tcPr>
+          <w:p>
+            <w:pPr>
+              <w:spacing w:after="0"/>
+            </w:pPr>
+            <w:r>
+              <w:rPr>
+                <w:sz w:val="19"/>
+                <w:szCs w:val="19"/>
+              </w:rPr>
+              <w:t xml:space="preserve">Server menolak membaca sebagian data (permission denied …)</w:t>
+            </w:r>
+          </w:p>
+        </w:tc>
+        <w:tc>
+          <w:tcPr>
+            <w:tcW w:type="dxa" w:w="5462"/>
+            <w:tcMar>
+              <w:top w:type="dxa" w:w="70"/>
+              <w:left w:type="dxa" w:w="110"/>
+              <w:bottom w:type="dxa" w:w="70"/>
+              <w:right w:type="dxa" w:w="110"/>
+            </w:tcMar>
+          </w:tcPr>
+          <w:p>
+            <w:pPr>
+              <w:spacing w:after="0"/>
+            </w:pPr>
+            <w:r>
+              <w:rPr>
+                <w:sz w:val="19"/>
+                <w:szCs w:val="19"/>
+              </w:rPr>
+              <w:t xml:space="preserve">Masalah pengaturan database, bukan peran akun Anda. Laporkan ke pengelola aplikasi beserta isi pesannya.</w:t>
+            </w:r>
+          </w:p>
+        </w:tc>
+      </w:tr>
+      <w:tr>
+        <w:trPr>
+          <w:cantSplit/>
+        </w:trPr>
+        <w:tc>
+          <w:tcPr>
+            <w:tcW w:type="dxa" w:w="4176"/>
+            <w:shd w:fill="F6F8FB" w:color="auto" w:val="clear"/>
+            <w:tcMar>
+              <w:top w:type="dxa" w:w="70"/>
+              <w:left w:type="dxa" w:w="110"/>
+              <w:bottom w:type="dxa" w:w="70"/>
+              <w:right w:type="dxa" w:w="110"/>
+            </w:tcMar>
+          </w:tcPr>
+          <w:p>
+            <w:pPr>
+              <w:spacing w:after="0"/>
+            </w:pPr>
+            <w:r>
+              <w:rPr>
+                <w:sz w:val="19"/>
+                <w:szCs w:val="19"/>
+              </w:rPr>
+              <w:t xml:space="preserve">Tidak ada selisih untuk orang ini — mungkin sudah dicatat.</w:t>
+            </w:r>
+          </w:p>
+        </w:tc>
+        <w:tc>
+          <w:tcPr>
+            <w:tcW w:type="dxa" w:w="5462"/>
+            <w:shd w:fill="F6F8FB" w:color="auto" w:val="clear"/>
+            <w:tcMar>
+              <w:top w:type="dxa" w:w="70"/>
+              <w:left w:type="dxa" w:w="110"/>
+              <w:bottom w:type="dxa" w:w="70"/>
+              <w:right w:type="dxa" w:w="110"/>
+            </w:tcMar>
+          </w:tcPr>
+          <w:p>
+            <w:pPr>
+              <w:spacing w:after="0"/>
+            </w:pPr>
+            <w:r>
+              <w:rPr>
+                <w:sz w:val="19"/>
+                <w:szCs w:val="19"/>
+              </w:rPr>
+              <w:t xml:space="preserve">Koreksinya sudah tercatat (lihat </w:t>
+            </w:r>
+            <w:r>
+              <w:rPr>
+                <w:b/>
+                <w:bCs/>
+                <w:sz w:val="19"/>
+                <w:szCs w:val="19"/>
+              </w:rPr>
+              <w:t xml:space="preserve">Koreksi tercatat</w:t>
+            </w:r>
+            <w:r>
+              <w:rPr>
+                <w:sz w:val="19"/>
+                <w:szCs w:val="19"/>
+              </w:rPr>
+              <w:t xml:space="preserve">). Tutup lalu buka lagi </w:t>
+            </w:r>
+            <w:r>
+              <w:rPr>
+                <w:b/>
+                <w:bCs/>
+                <w:sz w:val="19"/>
+                <w:szCs w:val="19"/>
+              </w:rPr>
+              <w:t xml:space="preserve">Selisih &amp; koreksi…</w:t>
+            </w:r>
+            <w:r>
+              <w:rPr>
+                <w:sz w:val="19"/>
+                <w:szCs w:val="19"/>
+              </w:rPr>
+              <w:t xml:space="preserve">.</w:t>
             </w:r>
           </w:p>
         </w:tc>
@@ -6997,7 +8052,7 @@
                 <w:sz w:val="19"/>
                 <w:szCs w:val="19"/>
               </w:rPr>
-              <w:t xml:space="preserve">Penyaluran utama / rincian tambahan</w:t>
+              <w:t xml:space="preserve">Koreksi / kuitansi susulan</w:t>
             </w:r>
           </w:p>
         </w:tc>
@@ -7021,7 +8076,7 @@
                 <w:sz w:val="19"/>
                 <w:szCs w:val="19"/>
               </w:rPr>
-              <w:t xml:space="preserve">Bentuk utama tunjangan / bagian tunjangan yang disalurkan ke tujuan lain.</w:t>
+              <w:t xml:space="preserve">Penyelesaian kurang atau lebih bayar pada periode yang sudah dikunci, tanpa mengubah struk dan rekap periode itu.</w:t>
             </w:r>
           </w:p>
         </w:tc>
@@ -7051,7 +8106,7 @@
                 <w:sz w:val="19"/>
                 <w:szCs w:val="19"/>
               </w:rPr>
-              <w:t xml:space="preserve">Bawaan</w:t>
+              <w:t xml:space="preserve">Penyaluran utama / rincian tambahan</w:t>
             </w:r>
           </w:p>
         </w:tc>
@@ -7074,7 +8129,7 @@
                 <w:sz w:val="19"/>
                 <w:szCs w:val="19"/>
               </w:rPr>
-              <w:t xml:space="preserve">Nominal umum yang berlaku bila seseorang tidak punya angka khusus.</w:t>
+              <w:t xml:space="preserve">Bentuk utama tunjangan / bagian tunjangan yang disalurkan ke tujuan lain.</w:t>
             </w:r>
           </w:p>
         </w:tc>
@@ -7105,7 +8160,7 @@
                 <w:sz w:val="19"/>
                 <w:szCs w:val="19"/>
               </w:rPr>
-              <w:t xml:space="preserve">Versi</w:t>
+              <w:t xml:space="preserve">Bawaan</w:t>
             </w:r>
           </w:p>
         </w:tc>
@@ -7129,7 +8184,7 @@
                 <w:sz w:val="19"/>
                 <w:szCs w:val="19"/>
               </w:rPr>
-              <w:t xml:space="preserve">Besaran dengan tanggal mulai berlakunya.</w:t>
+              <w:t xml:space="preserve">Nominal umum yang berlaku bila seseorang tidak punya angka khusus.</w:t>
             </w:r>
           </w:p>
         </w:tc>
@@ -7159,7 +8214,7 @@
                 <w:sz w:val="19"/>
                 <w:szCs w:val="19"/>
               </w:rPr>
-              <w:t xml:space="preserve">Transpor Berdiri</w:t>
+              <w:t xml:space="preserve">Versi</w:t>
             </w:r>
           </w:p>
         </w:tc>
@@ -7182,7 +8237,7 @@
                 <w:sz w:val="19"/>
                 <w:szCs w:val="19"/>
               </w:rPr>
-              <w:t xml:space="preserve">Transpor menurut jam kontrak/kerja per minggu, tidak bergantung kehadiran.</w:t>
+              <w:t xml:space="preserve">Besaran dengan tanggal mulai berlakunya.</w:t>
             </w:r>
           </w:p>
         </w:tc>
@@ -7213,7 +8268,7 @@
                 <w:sz w:val="19"/>
                 <w:szCs w:val="19"/>
               </w:rPr>
-              <w:t xml:space="preserve">Insentif / Konsumsi Kedatangan</w:t>
+              <w:t xml:space="preserve">Transpor Berdiri</w:t>
             </w:r>
           </w:p>
         </w:tc>
@@ -7237,7 +8292,7 @@
                 <w:sz w:val="19"/>
                 <w:szCs w:val="19"/>
               </w:rPr>
-              <w:t xml:space="preserve">Dibayar menurut jam hadir / hari datang.</w:t>
+              <w:t xml:space="preserve">Transpor menurut jam kontrak/kerja per minggu, tidak bergantung kehadiran.</w:t>
             </w:r>
           </w:p>
         </w:tc>
@@ -7267,7 +8322,7 @@
                 <w:sz w:val="19"/>
                 <w:szCs w:val="19"/>
               </w:rPr>
-              <w:t xml:space="preserve">Indeks</w:t>
+              <w:t xml:space="preserve">Insentif / Konsumsi Kedatangan</w:t>
             </w:r>
           </w:p>
         </w:tc>
@@ -7290,7 +8345,7 @@
                 <w:sz w:val="19"/>
                 <w:szCs w:val="19"/>
               </w:rPr>
-              <w:t xml:space="preserve">Pengali transpor dan insentif staf menurut masa kerja.</w:t>
+              <w:t xml:space="preserve">Dibayar menurut jam hadir / hari datang.</w:t>
             </w:r>
           </w:p>
         </w:tc>
@@ -7321,7 +8376,7 @@
                 <w:sz w:val="19"/>
                 <w:szCs w:val="19"/>
               </w:rPr>
-              <w:t xml:space="preserve">TMT</w:t>
+              <w:t xml:space="preserve">Indeks</w:t>
             </w:r>
           </w:p>
         </w:tc>
@@ -7345,7 +8400,7 @@
                 <w:sz w:val="19"/>
                 <w:szCs w:val="19"/>
               </w:rPr>
-              <w:t xml:space="preserve">Terhitung mulai tanggal; dasar masa kerja.</w:t>
+              <w:t xml:space="preserve">Pengali transpor dan insentif staf menurut masa kerja.</w:t>
             </w:r>
           </w:p>
         </w:tc>
@@ -7375,6 +8430,60 @@
                 <w:sz w:val="19"/>
                 <w:szCs w:val="19"/>
               </w:rPr>
+              <w:t xml:space="preserve">TMT</w:t>
+            </w:r>
+          </w:p>
+        </w:tc>
+        <w:tc>
+          <w:tcPr>
+            <w:tcW w:type="dxa" w:w="6586"/>
+            <w:tcMar>
+              <w:top w:type="dxa" w:w="70"/>
+              <w:left w:type="dxa" w:w="110"/>
+              <w:bottom w:type="dxa" w:w="70"/>
+              <w:right w:type="dxa" w:w="110"/>
+            </w:tcMar>
+          </w:tcPr>
+          <w:p>
+            <w:pPr>
+              <w:spacing w:after="0"/>
+            </w:pPr>
+            <w:r>
+              <w:rPr>
+                <w:sz w:val="19"/>
+                <w:szCs w:val="19"/>
+              </w:rPr>
+              <w:t xml:space="preserve">Terhitung mulai tanggal; dasar masa kerja.</w:t>
+            </w:r>
+          </w:p>
+        </w:tc>
+      </w:tr>
+      <w:tr>
+        <w:trPr>
+          <w:cantSplit/>
+        </w:trPr>
+        <w:tc>
+          <w:tcPr>
+            <w:tcW w:type="dxa" w:w="3052"/>
+            <w:shd w:fill="F6F8FB" w:color="auto" w:val="clear"/>
+            <w:tcMar>
+              <w:top w:type="dxa" w:w="70"/>
+              <w:left w:type="dxa" w:w="110"/>
+              <w:bottom w:type="dxa" w:w="70"/>
+              <w:right w:type="dxa" w:w="110"/>
+            </w:tcMar>
+          </w:tcPr>
+          <w:p>
+            <w:pPr>
+              <w:spacing w:after="0"/>
+            </w:pPr>
+            <w:r>
+              <w:rPr>
+                <w:b/>
+                <w:bCs/>
+                <w:sz w:val="19"/>
+                <w:szCs w:val="19"/>
+              </w:rPr>
               <w:t xml:space="preserve">Diterima Tunai</w:t>
             </w:r>
           </w:p>
@@ -7382,6 +8491,7 @@
         <w:tc>
           <w:tcPr>
             <w:tcW w:type="dxa" w:w="6586"/>
+            <w:shd w:fill="F6F8FB" w:color="auto" w:val="clear"/>
             <w:tcMar>
               <w:top w:type="dxa" w:w="70"/>
               <w:left w:type="dxa" w:w="110"/>
@@ -7670,6 +8780,12 @@
     </w:lvlOverride>
   </w:num>
   <w:num w:numId="7">
+    <w:abstractNumId w:val="2"/>
+    <w:lvlOverride w:ilvl="0">
+      <w:startOverride w:val="1"/>
+    </w:lvlOverride>
+  </w:num>
+  <w:num w:numId="8">
     <w:abstractNumId w:val="2"/>
     <w:lvlOverride w:ilvl="0">
       <w:startOverride w:val="1"/>

</xml_diff>

<commit_message>
Kurang bayar bisa ditambahkan ke struk bulan berikutnya (Koreksi periode lalu); Panduan
Co-Authored-By: Claude Opus 5.5 <noreply@anthropic.com>
</commit_message>
<xml_diff>
--- a/Panduan_Induk_Pembiayaan.docx
+++ b/Panduan_Induk_Pembiayaan.docx
@@ -6148,6 +6148,13 @@
               </w:rPr>
               <w:t xml:space="preserve">Kurang bayar</w:t>
             </w:r>
+            <w:r>
+              <w:rPr>
+                <w:sz w:val="19"/>
+                <w:szCs w:val="19"/>
+              </w:rPr>
+              <w:t xml:space="preserve">, dibayar terpisah</w:t>
+            </w:r>
           </w:p>
         </w:tc>
         <w:tc>
@@ -6166,12 +6173,35 @@
             </w:pPr>
             <w:r>
               <w:rPr>
-                <w:b/>
-                <w:bCs/>
-                <w:sz w:val="19"/>
-                <w:szCs w:val="19"/>
-              </w:rPr>
-              <w:t xml:space="preserve">Catat kuitansi susulan</w:t>
+                <w:sz w:val="19"/>
+                <w:szCs w:val="19"/>
+              </w:rPr>
+              <w:t xml:space="preserve">Pilih </w:t>
+            </w:r>
+            <w:r>
+              <w:rPr>
+                <w:b/>
+                <w:bCs/>
+                <w:sz w:val="19"/>
+                <w:szCs w:val="19"/>
+              </w:rPr>
+              <w:t xml:space="preserve">Kuitansi susulan</w:t>
+            </w:r>
+            <w:r>
+              <w:rPr>
+                <w:sz w:val="19"/>
+                <w:szCs w:val="19"/>
+              </w:rPr>
+              <w:t xml:space="preserve">, lalu </w:t>
+            </w:r>
+            <w:r>
+              <w:rPr>
+                <w:b/>
+                <w:bCs/>
+                <w:sz w:val="19"/>
+                <w:szCs w:val="19"/>
+              </w:rPr>
+              <w:t xml:space="preserve">Catat</w:t>
             </w:r>
             <w:r>
               <w:rPr>
@@ -6232,14 +6262,14 @@
                 <w:sz w:val="19"/>
                 <w:szCs w:val="19"/>
               </w:rPr>
-              <w:t xml:space="preserve">Lebih bayar</w:t>
-            </w:r>
-            <w:r>
-              <w:rPr>
-                <w:sz w:val="19"/>
-                <w:szCs w:val="19"/>
-              </w:rPr>
-              <w:t xml:space="preserve">, dikembalikan</w:t>
+              <w:t xml:space="preserve">Kurang bayar</w:t>
+            </w:r>
+            <w:r>
+              <w:rPr>
+                <w:sz w:val="19"/>
+                <w:szCs w:val="19"/>
+              </w:rPr>
+              <w:t xml:space="preserve">, ikut bulan berikutnya</w:t>
             </w:r>
           </w:p>
         </w:tc>
@@ -6272,14 +6302,14 @@
                 <w:sz w:val="19"/>
                 <w:szCs w:val="19"/>
               </w:rPr>
-              <w:t xml:space="preserve">Dikembalikan tunai</w:t>
-            </w:r>
-            <w:r>
-              <w:rPr>
-                <w:sz w:val="19"/>
-                <w:szCs w:val="19"/>
-              </w:rPr>
-              <w:t xml:space="preserve">, lalu </w:t>
+              <w:t xml:space="preserve">Ditambahkan ke struk bulan…</w:t>
+            </w:r>
+            <w:r>
+              <w:rPr>
+                <w:sz w:val="19"/>
+                <w:szCs w:val="19"/>
+              </w:rPr>
+              <w:t xml:space="preserve">, pilih bulannya (bawaan: bulan berikutnya), lalu </w:t>
             </w:r>
             <w:r>
               <w:rPr>
@@ -6319,7 +6349,39 @@
                 <w:sz w:val="19"/>
                 <w:szCs w:val="19"/>
               </w:rPr>
-              <w:t xml:space="preserve">Tanda terima pengembalian (Excel): diterima Bendahara dari orangnya, diketahui Kepala Sekolah.</w:t>
+              <w:t xml:space="preserve">Tidak ada dokumen terpisah: muncul sebagai bagian </w:t>
+            </w:r>
+            <w:r>
+              <w:rPr>
+                <w:b/>
+                <w:bCs/>
+                <w:sz w:val="19"/>
+                <w:szCs w:val="19"/>
+              </w:rPr>
+              <w:t xml:space="preserve">Koreksi periode lalu</w:t>
+            </w:r>
+            <w:r>
+              <w:rPr>
+                <w:sz w:val="19"/>
+                <w:szCs w:val="19"/>
+              </w:rPr>
+              <w:t xml:space="preserve"> ("Kekurangan bayar periode …") di struk bulan itu, dan sebagai kolom </w:t>
+            </w:r>
+            <w:r>
+              <w:rPr>
+                <w:b/>
+                <w:bCs/>
+                <w:sz w:val="19"/>
+                <w:szCs w:val="19"/>
+              </w:rPr>
+              <w:t xml:space="preserve">Koreksi Periode Lalu</w:t>
+            </w:r>
+            <w:r>
+              <w:rPr>
+                <w:sz w:val="19"/>
+                <w:szCs w:val="19"/>
+              </w:rPr>
+              <w:t xml:space="preserve"> di Keseluruhan. Ikut Jumlah Pendapatan dan Diterima Tunai.</w:t>
             </w:r>
           </w:p>
         </w:tc>
@@ -6356,6 +6418,122 @@
                 <w:sz w:val="19"/>
                 <w:szCs w:val="19"/>
               </w:rPr>
+              <w:t xml:space="preserve">, dikembalikan</w:t>
+            </w:r>
+          </w:p>
+        </w:tc>
+        <w:tc>
+          <w:tcPr>
+            <w:tcW w:type="dxa" w:w="3614"/>
+            <w:tcMar>
+              <w:top w:type="dxa" w:w="70"/>
+              <w:left w:type="dxa" w:w="110"/>
+              <w:bottom w:type="dxa" w:w="70"/>
+              <w:right w:type="dxa" w:w="110"/>
+            </w:tcMar>
+          </w:tcPr>
+          <w:p>
+            <w:pPr>
+              <w:spacing w:after="0"/>
+            </w:pPr>
+            <w:r>
+              <w:rPr>
+                <w:sz w:val="19"/>
+                <w:szCs w:val="19"/>
+              </w:rPr>
+              <w:t xml:space="preserve">Pilih </w:t>
+            </w:r>
+            <w:r>
+              <w:rPr>
+                <w:b/>
+                <w:bCs/>
+                <w:sz w:val="19"/>
+                <w:szCs w:val="19"/>
+              </w:rPr>
+              <w:t xml:space="preserve">Dikembalikan tunai</w:t>
+            </w:r>
+            <w:r>
+              <w:rPr>
+                <w:sz w:val="19"/>
+                <w:szCs w:val="19"/>
+              </w:rPr>
+              <w:t xml:space="preserve">, lalu </w:t>
+            </w:r>
+            <w:r>
+              <w:rPr>
+                <w:b/>
+                <w:bCs/>
+                <w:sz w:val="19"/>
+                <w:szCs w:val="19"/>
+              </w:rPr>
+              <w:t xml:space="preserve">Catat</w:t>
+            </w:r>
+            <w:r>
+              <w:rPr>
+                <w:sz w:val="19"/>
+                <w:szCs w:val="19"/>
+              </w:rPr>
+              <w:t xml:space="preserve">.</w:t>
+            </w:r>
+          </w:p>
+        </w:tc>
+        <w:tc>
+          <w:tcPr>
+            <w:tcW w:type="dxa" w:w="3915"/>
+            <w:tcMar>
+              <w:top w:type="dxa" w:w="70"/>
+              <w:left w:type="dxa" w:w="110"/>
+              <w:bottom w:type="dxa" w:w="70"/>
+              <w:right w:type="dxa" w:w="110"/>
+            </w:tcMar>
+          </w:tcPr>
+          <w:p>
+            <w:pPr>
+              <w:spacing w:after="0"/>
+            </w:pPr>
+            <w:r>
+              <w:rPr>
+                <w:sz w:val="19"/>
+                <w:szCs w:val="19"/>
+              </w:rPr>
+              <w:t xml:space="preserve">Tanda terima pengembalian (Excel): diterima Bendahara dari orangnya, diketahui Kepala Sekolah.</w:t>
+            </w:r>
+          </w:p>
+        </w:tc>
+      </w:tr>
+      <w:tr>
+        <w:trPr>
+          <w:cantSplit/>
+        </w:trPr>
+        <w:tc>
+          <w:tcPr>
+            <w:tcW w:type="dxa" w:w="2108"/>
+            <w:shd w:fill="F6F8FB" w:color="auto" w:val="clear"/>
+            <w:tcMar>
+              <w:top w:type="dxa" w:w="70"/>
+              <w:left w:type="dxa" w:w="110"/>
+              <w:bottom w:type="dxa" w:w="70"/>
+              <w:right w:type="dxa" w:w="110"/>
+            </w:tcMar>
+          </w:tcPr>
+          <w:p>
+            <w:pPr>
+              <w:spacing w:after="0"/>
+            </w:pPr>
+            <w:r>
+              <w:rPr>
+                <w:b/>
+                <w:bCs/>
+                <w:sz w:val="19"/>
+                <w:szCs w:val="19"/>
+              </w:rPr>
+              <w:t xml:space="preserve">Lebih bayar</w:t>
+            </w:r>
+            <w:r>
+              <w:rPr>
+                <w:sz w:val="19"/>
+                <w:szCs w:val="19"/>
+              </w:rPr>
               <w:t xml:space="preserve">, dipotong</w:t>
             </w:r>
           </w:p>
@@ -6363,6 +6541,7 @@
         <w:tc>
           <w:tcPr>
             <w:tcW w:type="dxa" w:w="3614"/>
+            <w:shd w:fill="F6F8FB" w:color="auto" w:val="clear"/>
             <w:tcMar>
               <w:top w:type="dxa" w:w="70"/>
               <w:left w:type="dxa" w:w="110"/>
@@ -6418,6 +6597,7 @@
         <w:tc>
           <w:tcPr>
             <w:tcW w:type="dxa" w:w="3915"/>
+            <w:shd w:fill="F6F8FB" w:color="auto" w:val="clear"/>
             <w:tcMar>
               <w:top w:type="dxa" w:w="70"/>
               <w:left w:type="dxa" w:w="110"/>
@@ -6494,7 +6674,7 @@
         <w:spacing w:after="60"/>
       </w:pPr>
       <w:r>
-        <w:t xml:space="preserve">Bulan potongan tidak boleh bulan yang sudah masuk periode terkunci (potongannya tidak akan pernah tampil di struk). Pembina dari luar hanya bisa dikembalikan tunai.</w:t>
+        <w:t xml:space="preserve">Bulan potongan atau penambahan tidak boleh bulan yang sudah masuk periode terkunci (tidak akan pernah tampil di struk). Pembina dari luar: lebih bayar hanya bisa dikembalikan tunai.</w:t>
       </w:r>
     </w:p>
     <w:p>
@@ -6527,7 +6707,30 @@
         <w:t xml:space="preserve">Dibatalkan</w:t>
       </w:r>
       <w:r>
-        <w:t xml:space="preserve"> dengan alasan; potongan bulan berikutnya ikut dihapus, kecuali bulan itu sudah dikunci. Koreksi tidak pernah dihapus.</w:t>
+        <w:t xml:space="preserve"> dengan alasan; potongan atau tambahan di bulan berikutnya ikut hilang, kecuali bulan itu sudah dikunci (sudah dibayarkan). Koreksi tidak pernah dihapus.</w:t>
+      </w:r>
+    </w:p>
+    <w:p>
+      <w:pPr>
+        <w:pStyle w:val="ListParagraph"/>
+        <w:numPr>
+          <w:ilvl w:val="0"/>
+          <w:numId w:val="1"/>
+        </w:numPr>
+        <w:spacing w:after="60"/>
+      </w:pPr>
+      <w:r>
+        <w:t xml:space="preserve">Kolom </w:t>
+      </w:r>
+      <w:r>
+        <w:rPr>
+          <w:b/>
+          <w:bCs/>
+        </w:rPr>
+        <w:t xml:space="preserve">Koreksi Periode Lalu</w:t>
+      </w:r>
+      <w:r>
+        <w:t xml:space="preserve"> di Keseluruhan hanya muncul pada periode yang memang memuat tambahan.</w:t>
       </w:r>
     </w:p>
     <w:p>
@@ -8076,7 +8279,7 @@
                 <w:sz w:val="19"/>
                 <w:szCs w:val="19"/>
               </w:rPr>
-              <w:t xml:space="preserve">Penyelesaian kurang atau lebih bayar pada periode yang sudah dikunci, tanpa mengubah struk dan rekap periode itu.</w:t>
+              <w:t xml:space="preserve">Penyelesaian kurang atau lebih bayar pada periode yang sudah dikunci, tanpa mengubah struk dan rekap periode itu. Kurang bayar: kuitansi susulan atau ditambahkan ke struk bulan berikutnya; lebih bayar: dikembalikan tunai atau dipotong bulan berikutnya.</w:t>
             </w:r>
           </w:p>
         </w:tc>

</xml_diff>

<commit_message>
Pendukung: pilihan dibayar per periode dengan tanggal Dari-Sampai sendiri
Senin-Jumat dianggap hadir di luar libur sekolah; kuitansi per periode;
tidak ikut Keseluruhan dan struk bulanan. Panduan diperbarui.

Co-Authored-By: Claude Opus 5.5 <noreply@anthropic.com>
</commit_message>
<xml_diff>
--- a/Panduan_Induk_Pembiayaan.docx
+++ b/Panduan_Induk_Pembiayaan.docx
@@ -3566,7 +3566,17 @@
         <w:t xml:space="preserve">Dibayar</w:t>
       </w:r>
       <w:r>
-        <w:t xml:space="preserve"> Bulanan atau Mingguan. Komponen yang tidak berlaku lagi diakhiri dengan </w:t>
+        <w:t xml:space="preserve"> Bulanan, Mingguan, atau </w:t>
+      </w:r>
+      <w:r>
+        <w:rPr>
+          <w:b/>
+          <w:bCs/>
+        </w:rPr>
+        <w:t xml:space="preserve">Per periode (Dari–Sampai)</w:t>
+      </w:r>
+      <w:r>
+        <w:t xml:space="preserve">. Komponen yang tidak berlaku lagi diakhiri dengan </w:t>
       </w:r>
       <w:r>
         <w:rPr>
@@ -3605,6 +3615,54 @@
       </w:r>
       <w:r>
         <w:t xml:space="preserve"> menurut Jam Kerja Staf di Data Induk — mis. bekerja Senin–Jumat: "pekan 12 Okt 2026 – 16 Okt 2026".</w:t>
+      </w:r>
+    </w:p>
+    <w:p>
+      <w:pPr>
+        <w:spacing w:after="120"/>
+      </w:pPr>
+      <w:r>
+        <w:t xml:space="preserve">Yang dibayar </w:t>
+      </w:r>
+      <w:r>
+        <w:rPr>
+          <w:b/>
+          <w:bCs/>
+        </w:rPr>
+        <w:t xml:space="preserve">per periode</w:t>
+      </w:r>
+      <w:r>
+        <w:t xml:space="preserve"> (mis. Kamal Sore, yang jadwalnya kadang berubah) punya tanggal </w:t>
+      </w:r>
+      <w:r>
+        <w:rPr>
+          <w:b/>
+          <w:bCs/>
+        </w:rPr>
+        <w:t xml:space="preserve">Dari</w:t>
+      </w:r>
+      <w:r>
+        <w:t xml:space="preserve"> dan </w:t>
+      </w:r>
+      <w:r>
+        <w:rPr>
+          <w:b/>
+          <w:bCs/>
+        </w:rPr>
+        <w:t xml:space="preserve">Sampai</w:t>
+      </w:r>
+      <w:r>
+        <w:t xml:space="preserve"> sendiri di kartunya (bawaannya rentang di atas). Kehadirannya </w:t>
+      </w:r>
+      <w:r>
+        <w:rPr>
+          <w:b/>
+          <w:bCs/>
+        </w:rPr>
+        <w:t xml:space="preserve">dianggap Senin–Jumat</w:t>
+      </w:r>
+      <w:r>
+        <w:t xml:space="preserve"> di luar hari libur sekolah, tanpa membaca catatan Kehadiran Staf; kuitansinya menyebut periode itu. Seperti yang mingguan, ia tidak ikut Keseluruhan dan struk bulanan.</w:t>
       </w:r>
     </w:p>
     <w:p>

</xml_diff>

<commit_message>
Pembimbing Tahfidz: kolom rata-rata siswa hadir dan keterangan aturan baru
Co-Authored-By: Claude Opus 5.5 <noreply@anthropic.com>
</commit_message>
<xml_diff>
--- a/Panduan_Induk_Pembiayaan.docx
+++ b/Panduan_Induk_Pembiayaan.docx
@@ -5368,7 +5368,7 @@
                 <w:sz w:val="19"/>
                 <w:szCs w:val="19"/>
               </w:rPr>
-              <w:t xml:space="preserve">Pembina ekskul / Tahfidz</w:t>
+              <w:t xml:space="preserve">Pembina ekskul</w:t>
             </w:r>
           </w:p>
         </w:tc>
@@ -5391,7 +5391,7 @@
                 <w:sz w:val="19"/>
                 <w:szCs w:val="19"/>
               </w:rPr>
-              <w:t xml:space="preserve">Per pertemuan yang berjalan dan dihadiri pembina, menurut jumlah siswa hadir. Bila beberapa pembimbing: dibagi rata kepada yang hadir. Tahfidz digenapkan ke bawah ke ribuan.</w:t>
+              <w:t xml:space="preserve">Per pertemuan yang berjalan dan dihadiri pembina, menurut jumlah siswa hadir pada pertemuan itu. Bila beberapa pembina: dibagi rata kepada yang hadir.</w:t>
             </w:r>
           </w:p>
         </w:tc>
@@ -5422,7 +5422,7 @@
                 <w:sz w:val="19"/>
                 <w:szCs w:val="19"/>
               </w:rPr>
-              <w:t xml:space="preserve">Gaji staf</w:t>
+              <w:t xml:space="preserve">Pembimbing Tahfidz (Imtaq)</w:t>
             </w:r>
           </w:p>
         </w:tc>
@@ -5446,7 +5446,7 @@
                 <w:sz w:val="19"/>
                 <w:szCs w:val="19"/>
               </w:rPr>
-              <w:t xml:space="preserve">Tarif per jam (menurut masa kerja) × jam kerja per minggu, dibulatkan ke atas ke ribuan; tunjangan jabatan = nominal per hari × hari kerja per minggu.</w:t>
+              <w:t xml:space="preserve">Siswa hadir semua pertemuan periode dijumlahkan, dibagi banyaknya pertemuan, dibulatkan = rata-rata siswa hadir. Rata-rata itu menentukan nominal menurut jenjang, lalu dikalikan pertemuan yang dihadiri pembimbing (tidak dibagi antarpembimbing). Digenapkan ke bawah ke ribuan.</w:t>
             </w:r>
           </w:p>
         </w:tc>
@@ -5476,7 +5476,7 @@
                 <w:sz w:val="19"/>
                 <w:szCs w:val="19"/>
               </w:rPr>
-              <w:t xml:space="preserve">Transpor &amp; insentif staf</w:t>
+              <w:t xml:space="preserve">Gaji staf</w:t>
             </w:r>
           </w:p>
         </w:tc>
@@ -5499,7 +5499,7 @@
                 <w:sz w:val="19"/>
                 <w:szCs w:val="19"/>
               </w:rPr>
-              <w:t xml:space="preserve">Transpor berdiri = tarif × jam kerja per minggu × indeks; insentif = tarif × jam hadir sebulan × indeks; konsumsi = tarif × hari hadir × indeks.</w:t>
+              <w:t xml:space="preserve">Tarif per jam (menurut masa kerja) × jam kerja per minggu, dibulatkan ke atas ke ribuan; tunjangan jabatan = nominal per hari × hari kerja per minggu.</w:t>
             </w:r>
           </w:p>
         </w:tc>
@@ -5530,7 +5530,7 @@
                 <w:sz w:val="19"/>
                 <w:szCs w:val="19"/>
               </w:rPr>
-              <w:t xml:space="preserve">Tenaga pendukung</w:t>
+              <w:t xml:space="preserve">Transpor &amp; insentif staf</w:t>
             </w:r>
           </w:p>
         </w:tc>
@@ -5538,6 +5538,59 @@
           <w:tcPr>
             <w:tcW w:type="dxa" w:w="7068"/>
             <w:shd w:fill="F6F8FB" w:color="auto" w:val="clear"/>
+            <w:tcMar>
+              <w:top w:type="dxa" w:w="70"/>
+              <w:left w:type="dxa" w:w="110"/>
+              <w:bottom w:type="dxa" w:w="70"/>
+              <w:right w:type="dxa" w:w="110"/>
+            </w:tcMar>
+          </w:tcPr>
+          <w:p>
+            <w:pPr>
+              <w:spacing w:after="0"/>
+            </w:pPr>
+            <w:r>
+              <w:rPr>
+                <w:sz w:val="19"/>
+                <w:szCs w:val="19"/>
+              </w:rPr>
+              <w:t xml:space="preserve">Transpor berdiri = tarif × jam kerja per minggu × indeks; insentif = tarif × jam hadir sebulan × indeks; konsumsi = tarif × hari hadir × indeks.</w:t>
+            </w:r>
+          </w:p>
+        </w:tc>
+      </w:tr>
+      <w:tr>
+        <w:trPr>
+          <w:cantSplit/>
+        </w:trPr>
+        <w:tc>
+          <w:tcPr>
+            <w:tcW w:type="dxa" w:w="2570"/>
+            <w:tcMar>
+              <w:top w:type="dxa" w:w="70"/>
+              <w:left w:type="dxa" w:w="110"/>
+              <w:bottom w:type="dxa" w:w="70"/>
+              <w:right w:type="dxa" w:w="110"/>
+            </w:tcMar>
+          </w:tcPr>
+          <w:p>
+            <w:pPr>
+              <w:spacing w:after="0"/>
+            </w:pPr>
+            <w:r>
+              <w:rPr>
+                <w:b/>
+                <w:bCs/>
+                <w:sz w:val="19"/>
+                <w:szCs w:val="19"/>
+              </w:rPr>
+              <w:t xml:space="preserve">Tenaga pendukung</w:t>
+            </w:r>
+          </w:p>
+        </w:tc>
+        <w:tc>
+          <w:tcPr>
+            <w:tcW w:type="dxa" w:w="7068"/>
             <w:tcMar>
               <w:top w:type="dxa" w:w="70"/>
               <w:left w:type="dxa" w:w="110"/>

</xml_diff>